<commit_message>
WIP cross platform porting.
-Link more necessary libraries in CMakeLists.
-Integrated cross platform memset/memcpy/move calls.
-Integrated cross platform system key definition.
-Process client events at once and carry on engine logic for better frame pace.
-static constexpr instead of static const for variables.
-Standardize std math usages.
-Avoid wide char hard-code for Linux.
-Removed more Win32 dependencies.
-Linux build is a success yay. Need to deal with runtime errors next.
</commit_message>
<xml_diff>
--- a/UHE_CodingStandard.docx
+++ b/UHE_CodingStandard.docx
@@ -1275,6 +1275,271 @@
       </w:pPr>
       <w:r>
         <w:t>If there are more than 2 parameters need to be bound to shader, implement BindParameters() function for them.</w:t>
+      </w:r>
+    </w:p>
+    <w:p>
+      <w:pPr>
+        <w:rPr>
+          <w:lang w:val="en-GB"/>
+        </w:rPr>
+      </w:pPr>
+    </w:p>
+    <w:p>
+      <w:pPr>
+        <w:pStyle w:val="a3"/>
+        <w:jc w:val="left"/>
+        <w:rPr>
+          <w:lang w:val="en-GB"/>
+        </w:rPr>
+      </w:pPr>
+      <w:r>
+        <w:rPr>
+          <w:lang w:val="en-GB"/>
+        </w:rPr>
+        <w:t>Cross Platform</w:t>
+      </w:r>
+    </w:p>
+    <w:p>
+      <w:pPr>
+        <w:pStyle w:val="a5"/>
+        <w:numPr>
+          <w:ilvl w:val="0"/>
+          <w:numId w:val="13"/>
+        </w:numPr>
+        <w:ind w:leftChars="0"/>
+        <w:rPr>
+          <w:lang w:val="en-GB"/>
+        </w:rPr>
+      </w:pPr>
+      <w:r>
+        <w:rPr>
+          <w:b/>
+          <w:color w:val="FF0000"/>
+          <w:lang w:val="en-GB"/>
+        </w:rPr>
+        <w:t>Whenever adding a new feature/implementation, think twice about cross platform compatibility</w:t>
+      </w:r>
+      <w:r>
+        <w:rPr>
+          <w:lang w:val="en-GB"/>
+        </w:rPr>
+        <w:t>.</w:t>
+      </w:r>
+    </w:p>
+    <w:p>
+      <w:pPr>
+        <w:pStyle w:val="a5"/>
+        <w:numPr>
+          <w:ilvl w:val="0"/>
+          <w:numId w:val="13"/>
+        </w:numPr>
+        <w:ind w:leftChars="0"/>
+        <w:rPr>
+          <w:lang w:val="en-GB"/>
+        </w:rPr>
+      </w:pPr>
+      <w:r>
+        <w:rPr>
+          <w:lang w:val="en-GB"/>
+        </w:rPr>
+        <w:t>Always include</w:t>
+      </w:r>
+      <w:r>
+        <w:rPr>
+          <w:lang w:val="en-GB"/>
+        </w:rPr>
+        <w:t xml:space="preserve"> &lt;cstdint&gt;</w:t>
+      </w:r>
+      <w:r>
+        <w:rPr>
+          <w:lang w:val="en-GB"/>
+        </w:rPr>
+        <w:t xml:space="preserve"> &lt;cmath&gt; &lt;cstring&gt;.</w:t>
+      </w:r>
+    </w:p>
+    <w:p>
+      <w:pPr>
+        <w:pStyle w:val="a5"/>
+        <w:numPr>
+          <w:ilvl w:val="0"/>
+          <w:numId w:val="13"/>
+        </w:numPr>
+        <w:ind w:leftChars="0"/>
+        <w:rPr>
+          <w:lang w:val="en-GB"/>
+        </w:rPr>
+      </w:pPr>
+      <w:r>
+        <w:rPr>
+          <w:lang w:val="en-GB"/>
+        </w:rPr>
+        <w:t xml:space="preserve">Always use </w:t>
+      </w:r>
+      <w:r>
+        <w:rPr>
+          <w:b/>
+          <w:lang w:val="en-GB"/>
+        </w:rPr>
+        <w:t>std::memset</w:t>
+      </w:r>
+      <w:r>
+        <w:rPr>
+          <w:lang w:val="en-GB"/>
+        </w:rPr>
+        <w:t xml:space="preserve"> or </w:t>
+      </w:r>
+      <w:r>
+        <w:rPr>
+          <w:b/>
+          <w:lang w:val="en-GB"/>
+        </w:rPr>
+        <w:t>std::memcpy</w:t>
+      </w:r>
+      <w:r>
+        <w:rPr>
+          <w:lang w:val="en-GB"/>
+        </w:rPr>
+        <w:t>. Instead of a plain memset/memcpy calls.</w:t>
+      </w:r>
+    </w:p>
+    <w:p>
+      <w:pPr>
+        <w:pStyle w:val="a5"/>
+        <w:numPr>
+          <w:ilvl w:val="0"/>
+          <w:numId w:val="13"/>
+        </w:numPr>
+        <w:ind w:leftChars="0"/>
+        <w:rPr>
+          <w:lang w:val="en-GB"/>
+        </w:rPr>
+      </w:pPr>
+      <w:r>
+        <w:rPr>
+          <w:lang w:val="en-GB"/>
+        </w:rPr>
+        <w:t>Avoid Win32 only types</w:t>
+      </w:r>
+      <w:r>
+        <w:rPr>
+          <w:lang w:val="en-GB"/>
+        </w:rPr>
+        <w:t xml:space="preserve"> and functions</w:t>
+      </w:r>
+      <w:r>
+        <w:rPr>
+          <w:lang w:val="en-GB"/>
+        </w:rPr>
+        <w:t xml:space="preserve"> in case they don’t work on Linux.</w:t>
+      </w:r>
+    </w:p>
+    <w:p>
+      <w:pPr>
+        <w:pStyle w:val="a5"/>
+        <w:numPr>
+          <w:ilvl w:val="0"/>
+          <w:numId w:val="13"/>
+        </w:numPr>
+        <w:ind w:leftChars="0"/>
+        <w:rPr>
+          <w:lang w:val="en-GB"/>
+        </w:rPr>
+      </w:pPr>
+      <w:r>
+        <w:rPr>
+          <w:lang w:val="en-GB"/>
+        </w:rPr>
+        <w:t>When a type is missing for either Windows or Linux build, just define a custom type.</w:t>
+      </w:r>
+    </w:p>
+    <w:p>
+      <w:pPr>
+        <w:pStyle w:val="a5"/>
+        <w:numPr>
+          <w:ilvl w:val="0"/>
+          <w:numId w:val="13"/>
+        </w:numPr>
+        <w:ind w:leftChars="0"/>
+        <w:rPr>
+          <w:lang w:val="en-GB"/>
+        </w:rPr>
+      </w:pPr>
+      <w:r>
+        <w:rPr>
+          <w:lang w:val="en-GB"/>
+        </w:rPr>
+        <w:t xml:space="preserve">Use </w:t>
+      </w:r>
+      <w:r>
+        <w:rPr>
+          <w:b/>
+          <w:color w:val="FF0000"/>
+          <w:lang w:val="en-GB"/>
+        </w:rPr>
+        <w:t>static constexpr</w:t>
+      </w:r>
+      <w:r>
+        <w:rPr>
+          <w:lang w:val="en-GB"/>
+        </w:rPr>
+        <w:t xml:space="preserve"> instead of static const for Linux, if cpp definition is not wanted.</w:t>
+      </w:r>
+    </w:p>
+    <w:p>
+      <w:pPr>
+        <w:pStyle w:val="a5"/>
+        <w:numPr>
+          <w:ilvl w:val="0"/>
+          <w:numId w:val="13"/>
+        </w:numPr>
+        <w:ind w:leftChars="0"/>
+        <w:rPr>
+          <w:lang w:val="en-GB"/>
+        </w:rPr>
+      </w:pPr>
+      <w:r>
+        <w:rPr>
+          <w:lang w:val="en-GB"/>
+        </w:rPr>
+        <w:t>When using C++ standard math functions, always use the ones without f or d postfix.</w:t>
+      </w:r>
+    </w:p>
+    <w:p>
+      <w:pPr>
+        <w:pStyle w:val="a5"/>
+        <w:numPr>
+          <w:ilvl w:val="0"/>
+          <w:numId w:val="13"/>
+        </w:numPr>
+        <w:ind w:leftChars="0"/>
+        <w:rPr>
+          <w:lang w:val="en-GB"/>
+        </w:rPr>
+      </w:pPr>
+      <w:r>
+        <w:rPr>
+          <w:lang w:val="en-GB"/>
+        </w:rPr>
+        <w:t xml:space="preserve">Using </w:t>
+      </w:r>
+      <w:r>
+        <w:rPr>
+          <w:b/>
+          <w:lang w:val="en-GB"/>
+        </w:rPr>
+        <w:t>memcpy</w:t>
+      </w:r>
+      <w:r>
+        <w:rPr>
+          <w:lang w:val="en-GB"/>
+        </w:rPr>
+        <w:t xml:space="preserve"> instead of memcpy_s. The latter is a Visual Studio only function.</w:t>
+      </w:r>
+      <w:r>
+        <w:rPr>
+          <w:lang w:val="en-GB"/>
+        </w:rPr>
+        <w:t xml:space="preserve"> Optionally insert an assert check before the copy.</w:t>
       </w:r>
     </w:p>
     <w:sectPr>
@@ -1643,6 +1908,119 @@
     </w:lvl>
   </w:abstractNum>
   <w:abstractNum w:abstractNumId="3">
+    <w:nsid w:val="0DDF6851"/>
+    <w:multiLevelType w:val="hybridMultilevel"/>
+    <w:tmpl w:val="5C62AEDE"/>
+    <w:lvl w:ilvl="0" w:tplc="04090001">
+      <w:start w:val="1"/>
+      <w:numFmt w:val="bullet"/>
+      <w:lvlText w:val=""/>
+      <w:lvlJc w:val="left"/>
+      <w:pPr>
+        <w:ind w:left="480" w:hanging="480"/>
+      </w:pPr>
+      <w:rPr>
+        <w:rFonts w:ascii="Wingdings" w:hAnsi="Wingdings" w:hint="default"/>
+      </w:rPr>
+    </w:lvl>
+    <w:lvl w:ilvl="1" w:tplc="04090003" w:tentative="1">
+      <w:start w:val="1"/>
+      <w:numFmt w:val="bullet"/>
+      <w:lvlText w:val=""/>
+      <w:lvlJc w:val="left"/>
+      <w:pPr>
+        <w:ind w:left="960" w:hanging="480"/>
+      </w:pPr>
+      <w:rPr>
+        <w:rFonts w:ascii="Wingdings" w:hAnsi="Wingdings" w:hint="default"/>
+      </w:rPr>
+    </w:lvl>
+    <w:lvl w:ilvl="2" w:tplc="04090005" w:tentative="1">
+      <w:start w:val="1"/>
+      <w:numFmt w:val="bullet"/>
+      <w:lvlText w:val=""/>
+      <w:lvlJc w:val="left"/>
+      <w:pPr>
+        <w:ind w:left="1440" w:hanging="480"/>
+      </w:pPr>
+      <w:rPr>
+        <w:rFonts w:ascii="Wingdings" w:hAnsi="Wingdings" w:hint="default"/>
+      </w:rPr>
+    </w:lvl>
+    <w:lvl w:ilvl="3" w:tplc="04090001" w:tentative="1">
+      <w:start w:val="1"/>
+      <w:numFmt w:val="bullet"/>
+      <w:lvlText w:val=""/>
+      <w:lvlJc w:val="left"/>
+      <w:pPr>
+        <w:ind w:left="1920" w:hanging="480"/>
+      </w:pPr>
+      <w:rPr>
+        <w:rFonts w:ascii="Wingdings" w:hAnsi="Wingdings" w:hint="default"/>
+      </w:rPr>
+    </w:lvl>
+    <w:lvl w:ilvl="4" w:tplc="04090003" w:tentative="1">
+      <w:start w:val="1"/>
+      <w:numFmt w:val="bullet"/>
+      <w:lvlText w:val=""/>
+      <w:lvlJc w:val="left"/>
+      <w:pPr>
+        <w:ind w:left="2400" w:hanging="480"/>
+      </w:pPr>
+      <w:rPr>
+        <w:rFonts w:ascii="Wingdings" w:hAnsi="Wingdings" w:hint="default"/>
+      </w:rPr>
+    </w:lvl>
+    <w:lvl w:ilvl="5" w:tplc="04090005" w:tentative="1">
+      <w:start w:val="1"/>
+      <w:numFmt w:val="bullet"/>
+      <w:lvlText w:val=""/>
+      <w:lvlJc w:val="left"/>
+      <w:pPr>
+        <w:ind w:left="2880" w:hanging="480"/>
+      </w:pPr>
+      <w:rPr>
+        <w:rFonts w:ascii="Wingdings" w:hAnsi="Wingdings" w:hint="default"/>
+      </w:rPr>
+    </w:lvl>
+    <w:lvl w:ilvl="6" w:tplc="04090001" w:tentative="1">
+      <w:start w:val="1"/>
+      <w:numFmt w:val="bullet"/>
+      <w:lvlText w:val=""/>
+      <w:lvlJc w:val="left"/>
+      <w:pPr>
+        <w:ind w:left="3360" w:hanging="480"/>
+      </w:pPr>
+      <w:rPr>
+        <w:rFonts w:ascii="Wingdings" w:hAnsi="Wingdings" w:hint="default"/>
+      </w:rPr>
+    </w:lvl>
+    <w:lvl w:ilvl="7" w:tplc="04090003" w:tentative="1">
+      <w:start w:val="1"/>
+      <w:numFmt w:val="bullet"/>
+      <w:lvlText w:val=""/>
+      <w:lvlJc w:val="left"/>
+      <w:pPr>
+        <w:ind w:left="3840" w:hanging="480"/>
+      </w:pPr>
+      <w:rPr>
+        <w:rFonts w:ascii="Wingdings" w:hAnsi="Wingdings" w:hint="default"/>
+      </w:rPr>
+    </w:lvl>
+    <w:lvl w:ilvl="8" w:tplc="04090005" w:tentative="1">
+      <w:start w:val="1"/>
+      <w:numFmt w:val="bullet"/>
+      <w:lvlText w:val=""/>
+      <w:lvlJc w:val="left"/>
+      <w:pPr>
+        <w:ind w:left="4320" w:hanging="480"/>
+      </w:pPr>
+      <w:rPr>
+        <w:rFonts w:ascii="Wingdings" w:hAnsi="Wingdings" w:hint="default"/>
+      </w:rPr>
+    </w:lvl>
+  </w:abstractNum>
+  <w:abstractNum w:abstractNumId="4">
     <w:nsid w:val="1D88262B"/>
     <w:multiLevelType w:val="hybridMultilevel"/>
     <w:tmpl w:val="C27A389A"/>
@@ -1755,7 +2133,7 @@
       </w:rPr>
     </w:lvl>
   </w:abstractNum>
-  <w:abstractNum w:abstractNumId="4">
+  <w:abstractNum w:abstractNumId="5">
     <w:nsid w:val="24CF4EC7"/>
     <w:multiLevelType w:val="hybridMultilevel"/>
     <w:tmpl w:val="EE1075E2"/>
@@ -1868,7 +2246,7 @@
       </w:rPr>
     </w:lvl>
   </w:abstractNum>
-  <w:abstractNum w:abstractNumId="5">
+  <w:abstractNum w:abstractNumId="6">
     <w:nsid w:val="349E435C"/>
     <w:multiLevelType w:val="hybridMultilevel"/>
     <w:tmpl w:val="FC447AD4"/>
@@ -1981,7 +2359,7 @@
       </w:rPr>
     </w:lvl>
   </w:abstractNum>
-  <w:abstractNum w:abstractNumId="6">
+  <w:abstractNum w:abstractNumId="7">
     <w:nsid w:val="3B8F0A38"/>
     <w:multiLevelType w:val="hybridMultilevel"/>
     <w:tmpl w:val="549A04AE"/>
@@ -2094,7 +2472,7 @@
       </w:rPr>
     </w:lvl>
   </w:abstractNum>
-  <w:abstractNum w:abstractNumId="7">
+  <w:abstractNum w:abstractNumId="8">
     <w:nsid w:val="42A90F40"/>
     <w:multiLevelType w:val="hybridMultilevel"/>
     <w:tmpl w:val="01D801CE"/>
@@ -2207,7 +2585,7 @@
       </w:rPr>
     </w:lvl>
   </w:abstractNum>
-  <w:abstractNum w:abstractNumId="8">
+  <w:abstractNum w:abstractNumId="9">
     <w:nsid w:val="479A1349"/>
     <w:multiLevelType w:val="hybridMultilevel"/>
     <w:tmpl w:val="3BD24910"/>
@@ -2320,7 +2698,7 @@
       </w:rPr>
     </w:lvl>
   </w:abstractNum>
-  <w:abstractNum w:abstractNumId="9">
+  <w:abstractNum w:abstractNumId="10">
     <w:nsid w:val="483E2587"/>
     <w:multiLevelType w:val="hybridMultilevel"/>
     <w:tmpl w:val="A216946A"/>
@@ -2433,7 +2811,7 @@
       </w:rPr>
     </w:lvl>
   </w:abstractNum>
-  <w:abstractNum w:abstractNumId="10">
+  <w:abstractNum w:abstractNumId="11">
     <w:nsid w:val="48AC3661"/>
     <w:multiLevelType w:val="hybridMultilevel"/>
     <w:tmpl w:val="ADC018C6"/>
@@ -2546,7 +2924,7 @@
       </w:rPr>
     </w:lvl>
   </w:abstractNum>
-  <w:abstractNum w:abstractNumId="11">
+  <w:abstractNum w:abstractNumId="12">
     <w:nsid w:val="6B7F2F33"/>
     <w:multiLevelType w:val="hybridMultilevel"/>
     <w:tmpl w:val="DF0A08A6"/>
@@ -2663,37 +3041,40 @@
     <w:abstractNumId w:val="2"/>
   </w:num>
   <w:num w:numId="2">
-    <w:abstractNumId w:val="3"/>
+    <w:abstractNumId w:val="4"/>
   </w:num>
   <w:num w:numId="3">
-    <w:abstractNumId w:val="5"/>
+    <w:abstractNumId w:val="6"/>
   </w:num>
   <w:num w:numId="4">
-    <w:abstractNumId w:val="11"/>
+    <w:abstractNumId w:val="12"/>
   </w:num>
   <w:num w:numId="5">
     <w:abstractNumId w:val="0"/>
   </w:num>
   <w:num w:numId="6">
-    <w:abstractNumId w:val="8"/>
+    <w:abstractNumId w:val="9"/>
   </w:num>
   <w:num w:numId="7">
-    <w:abstractNumId w:val="4"/>
+    <w:abstractNumId w:val="5"/>
   </w:num>
   <w:num w:numId="8">
     <w:abstractNumId w:val="1"/>
   </w:num>
   <w:num w:numId="9">
+    <w:abstractNumId w:val="11"/>
+  </w:num>
+  <w:num w:numId="10">
     <w:abstractNumId w:val="10"/>
   </w:num>
-  <w:num w:numId="10">
-    <w:abstractNumId w:val="9"/>
-  </w:num>
   <w:num w:numId="11">
-    <w:abstractNumId w:val="6"/>
+    <w:abstractNumId w:val="7"/>
   </w:num>
   <w:num w:numId="12">
-    <w:abstractNumId w:val="7"/>
+    <w:abstractNumId w:val="8"/>
+  </w:num>
+  <w:num w:numId="13">
+    <w:abstractNumId w:val="3"/>
   </w:num>
 </w:numbering>
 </file>

</xml_diff>

<commit_message>
Refactor file I/O and miscs
-Avoid using bool, long, size_t, raw structures in file I/O.
-Override file serialization operators for some structures.
-Make FPS show in release build too.
</commit_message>
<xml_diff>
--- a/UHE_CodingStandard.docx
+++ b/UHE_CodingStandard.docx
@@ -1181,40 +1181,33 @@
         <w:t>s debug only.</w:t>
       </w:r>
     </w:p>
-    <w:p/>
+    <w:p>
+      <w:pPr>
+        <w:rPr>
+          <w:lang w:val="en-GB"/>
+        </w:rPr>
+      </w:pPr>
+    </w:p>
     <w:p>
       <w:pPr>
         <w:pStyle w:val="a3"/>
         <w:jc w:val="left"/>
       </w:pPr>
       <w:r>
-        <w:t>DirectXMath</w:t>
-      </w:r>
-    </w:p>
-    <w:p>
-      <w:pPr>
-        <w:pStyle w:val="a5"/>
-        <w:numPr>
-          <w:ilvl w:val="0"/>
-          <w:numId w:val="10"/>
-        </w:numPr>
-        <w:ind w:leftChars="0"/>
-      </w:pPr>
-      <w:r>
-        <w:t>Always use XMFLOAT, XMFLOAT4X4..etc as class member</w:t>
-      </w:r>
-    </w:p>
-    <w:p>
-      <w:pPr>
-        <w:pStyle w:val="a5"/>
-        <w:numPr>
-          <w:ilvl w:val="0"/>
-          <w:numId w:val="10"/>
-        </w:numPr>
-        <w:ind w:leftChars="0"/>
-      </w:pPr>
-      <w:r>
-        <w:t>Only convert to XMVETOR/XMMATRIX if computation is needed</w:t>
+        <w:t>Compute / Ray Tracing Shader</w:t>
+      </w:r>
+    </w:p>
+    <w:p>
+      <w:pPr>
+        <w:pStyle w:val="a5"/>
+        <w:numPr>
+          <w:ilvl w:val="0"/>
+          <w:numId w:val="12"/>
+        </w:numPr>
+        <w:ind w:leftChars="0"/>
+      </w:pPr>
+      <w:r>
+        <w:t>Always remember (+0.5f) when converting dispatch index to UV.</w:t>
       </w:r>
     </w:p>
     <w:p/>
@@ -1224,7 +1217,7 @@
         <w:jc w:val="left"/>
       </w:pPr>
       <w:r>
-        <w:t>Compute / Ray Tracing Shader</w:t>
+        <w:t>Shader Implementation</w:t>
       </w:r>
     </w:p>
     <w:p>
@@ -1237,65 +1230,42 @@
         <w:ind w:leftChars="0"/>
       </w:pPr>
       <w:r>
-        <w:t>Always remember (+0.5f) when converting dispatch index to UV.</w:t>
-      </w:r>
-    </w:p>
-    <w:p/>
+        <w:t>Separate header and cpp files.</w:t>
+      </w:r>
+    </w:p>
+    <w:p>
+      <w:pPr>
+        <w:pStyle w:val="a5"/>
+        <w:numPr>
+          <w:ilvl w:val="0"/>
+          <w:numId w:val="12"/>
+        </w:numPr>
+        <w:ind w:leftChars="0"/>
+      </w:pPr>
+      <w:r>
+        <w:t>If there are more than 2 parameters need to be bound to shader, implement BindParameters() function for them.</w:t>
+      </w:r>
+    </w:p>
+    <w:p>
+      <w:pPr>
+        <w:rPr>
+          <w:lang w:val="en-GB"/>
+        </w:rPr>
+      </w:pPr>
+    </w:p>
     <w:p>
       <w:pPr>
         <w:pStyle w:val="a3"/>
         <w:jc w:val="left"/>
-      </w:pPr>
-      <w:r>
-        <w:t>Shader Implementation</w:t>
-      </w:r>
-    </w:p>
-    <w:p>
-      <w:pPr>
-        <w:pStyle w:val="a5"/>
-        <w:numPr>
-          <w:ilvl w:val="0"/>
-          <w:numId w:val="12"/>
-        </w:numPr>
-        <w:ind w:leftChars="0"/>
-      </w:pPr>
-      <w:r>
+        <w:rPr>
+          <w:lang w:val="en-GB"/>
+        </w:rPr>
+      </w:pPr>
+      <w:r>
+        <w:rPr>
+          <w:lang w:val="en-GB"/>
+        </w:rPr>
         <w:lastRenderedPageBreak/>
-        <w:t>Separate header and cpp files.</w:t>
-      </w:r>
-    </w:p>
-    <w:p>
-      <w:pPr>
-        <w:pStyle w:val="a5"/>
-        <w:numPr>
-          <w:ilvl w:val="0"/>
-          <w:numId w:val="12"/>
-        </w:numPr>
-        <w:ind w:leftChars="0"/>
-      </w:pPr>
-      <w:r>
-        <w:t>If there are more than 2 parameters need to be bound to shader, implement BindParameters() function for them.</w:t>
-      </w:r>
-    </w:p>
-    <w:p>
-      <w:pPr>
-        <w:rPr>
-          <w:lang w:val="en-GB"/>
-        </w:rPr>
-      </w:pPr>
-    </w:p>
-    <w:p>
-      <w:pPr>
-        <w:pStyle w:val="a3"/>
-        <w:jc w:val="left"/>
-        <w:rPr>
-          <w:lang w:val="en-GB"/>
-        </w:rPr>
-      </w:pPr>
-      <w:r>
-        <w:rPr>
-          <w:lang w:val="en-GB"/>
-        </w:rPr>
         <w:t>Cross Platform</w:t>
       </w:r>
     </w:p>
@@ -1592,20 +1562,14 @@
           <w:color w:val="000000" w:themeColor="text1"/>
           <w:lang w:val="en-GB"/>
         </w:rPr>
-        <w:t>Always specify a size</w:t>
-      </w:r>
-      <w:r>
-        <w:rPr>
-          <w:lang w:val="en-GB"/>
-        </w:rPr>
-        <w:t xml:space="preserve"> for any enum classes. This is for safe file serialization.</w:t>
-      </w:r>
-    </w:p>
-    <w:p>
-      <w:pPr>
-        <w:pStyle w:val="a5"/>
-        <w:numPr>
-          <w:ilvl w:val="0"/>
+        <w:t>Avoid following types for file I/O</w:t>
+      </w:r>
+    </w:p>
+    <w:p>
+      <w:pPr>
+        <w:pStyle w:val="a5"/>
+        <w:numPr>
+          <w:ilvl w:val="1"/>
           <w:numId w:val="13"/>
         </w:numPr>
         <w:ind w:leftChars="0"/>
@@ -1619,15 +1583,106 @@
           <w:color w:val="000000" w:themeColor="text1"/>
           <w:lang w:val="en-GB"/>
         </w:rPr>
-        <w:t xml:space="preserve">Do not write/read size_t for files. </w:t>
-      </w:r>
-      <w:r>
-        <w:rPr>
+        <w:t>Long</w:t>
+      </w:r>
+    </w:p>
+    <w:p>
+      <w:pPr>
+        <w:pStyle w:val="a5"/>
+        <w:numPr>
+          <w:ilvl w:val="1"/>
+          <w:numId w:val="13"/>
+        </w:numPr>
+        <w:ind w:leftChars="0"/>
+        <w:rPr>
+          <w:lang w:val="en-GB"/>
+        </w:rPr>
+      </w:pPr>
+      <w:r>
+        <w:rPr>
+          <w:b/>
           <w:color w:val="000000" w:themeColor="text1"/>
           <w:lang w:val="en-GB"/>
         </w:rPr>
-        <w:t>size_t can be platform specific.</w:t>
-      </w:r>
+        <w:t>Size_t</w:t>
+      </w:r>
+    </w:p>
+    <w:p>
+      <w:pPr>
+        <w:pStyle w:val="a5"/>
+        <w:numPr>
+          <w:ilvl w:val="1"/>
+          <w:numId w:val="13"/>
+        </w:numPr>
+        <w:ind w:leftChars="0"/>
+        <w:rPr>
+          <w:lang w:val="en-GB"/>
+        </w:rPr>
+      </w:pPr>
+      <w:r>
+        <w:rPr>
+          <w:b/>
+          <w:color w:val="000000" w:themeColor="text1"/>
+          <w:lang w:val="en-GB"/>
+        </w:rPr>
+        <w:t>Bool</w:t>
+      </w:r>
+    </w:p>
+    <w:p>
+      <w:pPr>
+        <w:pStyle w:val="a5"/>
+        <w:numPr>
+          <w:ilvl w:val="1"/>
+          <w:numId w:val="13"/>
+        </w:numPr>
+        <w:ind w:leftChars="0"/>
+        <w:rPr>
+          <w:lang w:val="en-GB"/>
+        </w:rPr>
+      </w:pPr>
+      <w:r>
+        <w:rPr>
+          <w:b/>
+          <w:color w:val="000000" w:themeColor="text1"/>
+          <w:lang w:val="en-GB"/>
+        </w:rPr>
+        <w:t>Enums (unless exact size specified)</w:t>
+      </w:r>
+    </w:p>
+    <w:p>
+      <w:pPr>
+        <w:pStyle w:val="a5"/>
+        <w:numPr>
+          <w:ilvl w:val="1"/>
+          <w:numId w:val="13"/>
+        </w:numPr>
+        <w:ind w:leftChars="0"/>
+        <w:rPr>
+          <w:lang w:val="en-GB"/>
+        </w:rPr>
+      </w:pPr>
+      <w:r>
+        <w:rPr>
+          <w:b/>
+          <w:color w:val="000000" w:themeColor="text1"/>
+          <w:lang w:val="en-GB"/>
+        </w:rPr>
+        <w:t>Raw structs</w:t>
+      </w:r>
+    </w:p>
+    <w:p>
+      <w:pPr>
+        <w:rPr>
+          <w:lang w:val="en-GB"/>
+        </w:rPr>
+      </w:pPr>
+    </w:p>
+    <w:p>
+      <w:pPr>
+        <w:rPr>
+          <w:lang w:val="en-GB"/>
+        </w:rPr>
+      </w:pPr>
     </w:p>
     <w:sectPr>
       <w:pgSz w:w="11906" w:h="16838"/>
@@ -2010,7 +2065,7 @@
         <w:rFonts w:ascii="Wingdings" w:hAnsi="Wingdings" w:hint="default"/>
       </w:rPr>
     </w:lvl>
-    <w:lvl w:ilvl="1" w:tplc="04090003" w:tentative="1">
+    <w:lvl w:ilvl="1" w:tplc="04090003">
       <w:start w:val="1"/>
       <w:numFmt w:val="bullet"/>
       <w:lvlText w:val=""/>

</xml_diff>